<commit_message>
Corregir errores detectado y elimine archivos sobrantes
</commit_message>
<xml_diff>
--- a/Momento 1/Entregable completo - Momento 1 CAGC.docx
+++ b/Momento 1/Entregable completo - Momento 1 CAGC.docx
@@ -362,6 +362,8 @@
     </w:p>
     <w:p>
       <w:pPr>
+        <w:ind w:left="708" w:hanging="708"/>
+        <w:jc w:val="center"/>
         <w:rPr>
           <w:rFonts w:ascii="Consolas" w:hAnsi="Consolas" w:cs="Consolas"/>
           <w:lang w:val="en-US"/>
@@ -391,938 +393,6 @@
           <w:lang w:val="en-US"/>
         </w:rPr>
         <w:t>SistemaAlertaInventario</w:t>
-      </w:r>
-      <w:proofErr w:type="spellEnd"/>
-    </w:p>
-    <w:p>
-      <w:pPr>
-        <w:rPr>
-          <w:rFonts w:ascii="Consolas" w:hAnsi="Consolas" w:cs="Consolas"/>
-          <w:lang w:val="en-US"/>
-        </w:rPr>
-      </w:pPr>
-      <w:r>
-        <w:rPr>
-          <w:rFonts w:ascii="Consolas" w:hAnsi="Consolas" w:cs="Consolas"/>
-          <w:lang w:val="en-US"/>
-        </w:rPr>
-        <w:tab/>
-        <w:t>//Variables to set the value of the stock</w:t>
-      </w:r>
-    </w:p>
-    <w:p>
-      <w:pPr>
-        <w:rPr>
-          <w:rFonts w:ascii="Consolas" w:hAnsi="Consolas" w:cs="Consolas"/>
-          <w:lang w:val="en-US"/>
-        </w:rPr>
-      </w:pPr>
-      <w:r>
-        <w:rPr>
-          <w:rFonts w:ascii="Consolas" w:hAnsi="Consolas" w:cs="Consolas"/>
-          <w:lang w:val="en-US"/>
-        </w:rPr>
-        <w:tab/>
-      </w:r>
-      <w:proofErr w:type="spellStart"/>
-      <w:r>
-        <w:rPr>
-          <w:rFonts w:ascii="Consolas" w:hAnsi="Consolas" w:cs="Consolas"/>
-          <w:lang w:val="en-US"/>
-        </w:rPr>
-        <w:t>Definir</w:t>
-      </w:r>
-      <w:proofErr w:type="spellEnd"/>
-      <w:r>
-        <w:rPr>
-          <w:rFonts w:ascii="Consolas" w:hAnsi="Consolas" w:cs="Consolas"/>
-          <w:lang w:val="en-US"/>
-        </w:rPr>
-        <w:t xml:space="preserve"> </w:t>
-      </w:r>
-      <w:proofErr w:type="spellStart"/>
-      <w:r>
-        <w:rPr>
-          <w:rFonts w:ascii="Consolas" w:hAnsi="Consolas" w:cs="Consolas"/>
-          <w:lang w:val="en-US"/>
-        </w:rPr>
-        <w:t>currentStock</w:t>
-      </w:r>
-      <w:proofErr w:type="spellEnd"/>
-      <w:r>
-        <w:rPr>
-          <w:rFonts w:ascii="Consolas" w:hAnsi="Consolas" w:cs="Consolas"/>
-          <w:lang w:val="en-US"/>
-        </w:rPr>
-        <w:t xml:space="preserve">, </w:t>
-      </w:r>
-      <w:proofErr w:type="spellStart"/>
-      <w:r>
-        <w:rPr>
-          <w:rFonts w:ascii="Consolas" w:hAnsi="Consolas" w:cs="Consolas"/>
-          <w:lang w:val="en-US"/>
-        </w:rPr>
-        <w:t>minimumStock</w:t>
-      </w:r>
-      <w:proofErr w:type="spellEnd"/>
-      <w:r>
-        <w:rPr>
-          <w:rFonts w:ascii="Consolas" w:hAnsi="Consolas" w:cs="Consolas"/>
-          <w:lang w:val="en-US"/>
-        </w:rPr>
-        <w:t xml:space="preserve">, </w:t>
-      </w:r>
-      <w:proofErr w:type="spellStart"/>
-      <w:r>
-        <w:rPr>
-          <w:rFonts w:ascii="Consolas" w:hAnsi="Consolas" w:cs="Consolas"/>
-          <w:lang w:val="en-US"/>
-        </w:rPr>
-        <w:t>maximumStock</w:t>
-      </w:r>
-      <w:proofErr w:type="spellEnd"/>
-      <w:r>
-        <w:rPr>
-          <w:rFonts w:ascii="Consolas" w:hAnsi="Consolas" w:cs="Consolas"/>
-          <w:lang w:val="en-US"/>
-        </w:rPr>
-        <w:t xml:space="preserve"> Como Real;</w:t>
-      </w:r>
-    </w:p>
-    <w:p>
-      <w:pPr>
-        <w:rPr>
-          <w:rFonts w:ascii="Consolas" w:hAnsi="Consolas" w:cs="Consolas"/>
-          <w:lang w:val="en-US"/>
-        </w:rPr>
-      </w:pPr>
-      <w:r>
-        <w:rPr>
-          <w:rFonts w:ascii="Consolas" w:hAnsi="Consolas" w:cs="Consolas"/>
-          <w:lang w:val="en-US"/>
-        </w:rPr>
-        <w:tab/>
-        <w:t>//Variable to store the name of the product</w:t>
-      </w:r>
-    </w:p>
-    <w:p>
-      <w:pPr>
-        <w:rPr>
-          <w:rFonts w:ascii="Consolas" w:hAnsi="Consolas" w:cs="Consolas"/>
-          <w:lang w:val="en-US"/>
-        </w:rPr>
-      </w:pPr>
-      <w:r>
-        <w:rPr>
-          <w:rFonts w:ascii="Consolas" w:hAnsi="Consolas" w:cs="Consolas"/>
-          <w:lang w:val="en-US"/>
-        </w:rPr>
-        <w:tab/>
-      </w:r>
-      <w:proofErr w:type="spellStart"/>
-      <w:r>
-        <w:rPr>
-          <w:rFonts w:ascii="Consolas" w:hAnsi="Consolas" w:cs="Consolas"/>
-          <w:lang w:val="en-US"/>
-        </w:rPr>
-        <w:t>Definir</w:t>
-      </w:r>
-      <w:proofErr w:type="spellEnd"/>
-      <w:r>
-        <w:rPr>
-          <w:rFonts w:ascii="Consolas" w:hAnsi="Consolas" w:cs="Consolas"/>
-          <w:lang w:val="en-US"/>
-        </w:rPr>
-        <w:t xml:space="preserve"> </w:t>
-      </w:r>
-      <w:proofErr w:type="spellStart"/>
-      <w:r>
-        <w:rPr>
-          <w:rFonts w:ascii="Consolas" w:hAnsi="Consolas" w:cs="Consolas"/>
-          <w:lang w:val="en-US"/>
-        </w:rPr>
-        <w:t>nameProduct</w:t>
-      </w:r>
-      <w:proofErr w:type="spellEnd"/>
-      <w:r>
-        <w:rPr>
-          <w:rFonts w:ascii="Consolas" w:hAnsi="Consolas" w:cs="Consolas"/>
-          <w:lang w:val="en-US"/>
-        </w:rPr>
-        <w:t xml:space="preserve"> </w:t>
-      </w:r>
-      <w:proofErr w:type="spellStart"/>
-      <w:r>
-        <w:rPr>
-          <w:rFonts w:ascii="Consolas" w:hAnsi="Consolas" w:cs="Consolas"/>
-          <w:lang w:val="en-US"/>
-        </w:rPr>
-        <w:t>como</w:t>
-      </w:r>
-      <w:proofErr w:type="spellEnd"/>
-      <w:r>
-        <w:rPr>
-          <w:rFonts w:ascii="Consolas" w:hAnsi="Consolas" w:cs="Consolas"/>
-          <w:lang w:val="en-US"/>
-        </w:rPr>
-        <w:t xml:space="preserve"> Cadena;</w:t>
-      </w:r>
-    </w:p>
-    <w:p>
-      <w:pPr>
-        <w:rPr>
-          <w:rFonts w:ascii="Consolas" w:hAnsi="Consolas" w:cs="Consolas"/>
-          <w:lang w:val="en-US"/>
-        </w:rPr>
-      </w:pPr>
-      <w:r>
-        <w:rPr>
-          <w:rFonts w:ascii="Consolas" w:hAnsi="Consolas" w:cs="Consolas"/>
-          <w:lang w:val="en-US"/>
-        </w:rPr>
-        <w:tab/>
-        <w:t>//Variable to verify if the product requires an audit</w:t>
-      </w:r>
-    </w:p>
-    <w:p>
-      <w:pPr>
-        <w:rPr>
-          <w:rFonts w:ascii="Consolas" w:hAnsi="Consolas" w:cs="Consolas"/>
-          <w:lang w:val="en-US"/>
-        </w:rPr>
-      </w:pPr>
-      <w:r>
-        <w:rPr>
-          <w:rFonts w:ascii="Consolas" w:hAnsi="Consolas" w:cs="Consolas"/>
-          <w:lang w:val="en-US"/>
-        </w:rPr>
-        <w:tab/>
-      </w:r>
-      <w:proofErr w:type="spellStart"/>
-      <w:r>
-        <w:rPr>
-          <w:rFonts w:ascii="Consolas" w:hAnsi="Consolas" w:cs="Consolas"/>
-          <w:lang w:val="en-US"/>
-        </w:rPr>
-        <w:t>Definir</w:t>
-      </w:r>
-      <w:proofErr w:type="spellEnd"/>
-      <w:r>
-        <w:rPr>
-          <w:rFonts w:ascii="Consolas" w:hAnsi="Consolas" w:cs="Consolas"/>
-          <w:lang w:val="en-US"/>
-        </w:rPr>
-        <w:t xml:space="preserve"> </w:t>
-      </w:r>
-      <w:proofErr w:type="spellStart"/>
-      <w:r>
-        <w:rPr>
-          <w:rFonts w:ascii="Consolas" w:hAnsi="Consolas" w:cs="Consolas"/>
-          <w:lang w:val="en-US"/>
-        </w:rPr>
-        <w:t>requiresAudit</w:t>
-      </w:r>
-      <w:proofErr w:type="spellEnd"/>
-      <w:r>
-        <w:rPr>
-          <w:rFonts w:ascii="Consolas" w:hAnsi="Consolas" w:cs="Consolas"/>
-          <w:lang w:val="en-US"/>
-        </w:rPr>
-        <w:t xml:space="preserve"> </w:t>
-      </w:r>
-      <w:proofErr w:type="spellStart"/>
-      <w:r>
-        <w:rPr>
-          <w:rFonts w:ascii="Consolas" w:hAnsi="Consolas" w:cs="Consolas"/>
-          <w:lang w:val="en-US"/>
-        </w:rPr>
-        <w:t>como</w:t>
-      </w:r>
-      <w:proofErr w:type="spellEnd"/>
-      <w:r>
-        <w:rPr>
-          <w:rFonts w:ascii="Consolas" w:hAnsi="Consolas" w:cs="Consolas"/>
-          <w:lang w:val="en-US"/>
-        </w:rPr>
-        <w:t xml:space="preserve"> </w:t>
-      </w:r>
-      <w:proofErr w:type="spellStart"/>
-      <w:r>
-        <w:rPr>
-          <w:rFonts w:ascii="Consolas" w:hAnsi="Consolas" w:cs="Consolas"/>
-          <w:lang w:val="en-US"/>
-        </w:rPr>
-        <w:t>Logico</w:t>
-      </w:r>
-      <w:proofErr w:type="spellEnd"/>
-      <w:r>
-        <w:rPr>
-          <w:rFonts w:ascii="Consolas" w:hAnsi="Consolas" w:cs="Consolas"/>
-          <w:lang w:val="en-US"/>
-        </w:rPr>
-        <w:t>;</w:t>
-      </w:r>
-    </w:p>
-    <w:p>
-      <w:pPr>
-        <w:rPr>
-          <w:rFonts w:ascii="Consolas" w:hAnsi="Consolas" w:cs="Consolas"/>
-          <w:lang w:val="en-US"/>
-        </w:rPr>
-      </w:pPr>
-      <w:r>
-        <w:rPr>
-          <w:rFonts w:ascii="Consolas" w:hAnsi="Consolas" w:cs="Consolas"/>
-          <w:lang w:val="en-US"/>
-        </w:rPr>
-        <w:tab/>
-      </w:r>
-    </w:p>
-    <w:p>
-      <w:pPr>
-        <w:rPr>
-          <w:rFonts w:ascii="Consolas" w:hAnsi="Consolas" w:cs="Consolas"/>
-          <w:lang w:val="en-US"/>
-        </w:rPr>
-      </w:pPr>
-      <w:r>
-        <w:rPr>
-          <w:rFonts w:ascii="Consolas" w:hAnsi="Consolas" w:cs="Consolas"/>
-          <w:lang w:val="en-US"/>
-        </w:rPr>
-        <w:tab/>
-        <w:t>//Ask for the product name and store it</w:t>
-      </w:r>
-    </w:p>
-    <w:p>
-      <w:pPr>
-        <w:rPr>
-          <w:rFonts w:ascii="Consolas" w:hAnsi="Consolas" w:cs="Consolas"/>
-          <w:lang w:val="en-US"/>
-        </w:rPr>
-      </w:pPr>
-      <w:r>
-        <w:rPr>
-          <w:rFonts w:ascii="Consolas" w:hAnsi="Consolas" w:cs="Consolas"/>
-          <w:lang w:val="en-US"/>
-        </w:rPr>
-        <w:tab/>
-      </w:r>
-      <w:proofErr w:type="spellStart"/>
-      <w:r>
-        <w:rPr>
-          <w:rFonts w:ascii="Consolas" w:hAnsi="Consolas" w:cs="Consolas"/>
-          <w:lang w:val="en-US"/>
-        </w:rPr>
-        <w:t>Escribir</w:t>
-      </w:r>
-      <w:proofErr w:type="spellEnd"/>
-      <w:r>
-        <w:rPr>
-          <w:rFonts w:ascii="Consolas" w:hAnsi="Consolas" w:cs="Consolas"/>
-          <w:lang w:val="en-US"/>
-        </w:rPr>
-        <w:t xml:space="preserve"> "What is the name of the product";</w:t>
-      </w:r>
-    </w:p>
-    <w:p>
-      <w:pPr>
-        <w:rPr>
-          <w:rFonts w:ascii="Consolas" w:hAnsi="Consolas" w:cs="Consolas"/>
-          <w:lang w:val="en-US"/>
-        </w:rPr>
-      </w:pPr>
-      <w:r>
-        <w:rPr>
-          <w:rFonts w:ascii="Consolas" w:hAnsi="Consolas" w:cs="Consolas"/>
-          <w:lang w:val="en-US"/>
-        </w:rPr>
-        <w:tab/>
-        <w:t xml:space="preserve">Leer </w:t>
-      </w:r>
-      <w:proofErr w:type="spellStart"/>
-      <w:r>
-        <w:rPr>
-          <w:rFonts w:ascii="Consolas" w:hAnsi="Consolas" w:cs="Consolas"/>
-          <w:lang w:val="en-US"/>
-        </w:rPr>
-        <w:t>nameProduct</w:t>
-      </w:r>
-      <w:proofErr w:type="spellEnd"/>
-      <w:r>
-        <w:rPr>
-          <w:rFonts w:ascii="Consolas" w:hAnsi="Consolas" w:cs="Consolas"/>
-          <w:lang w:val="en-US"/>
-        </w:rPr>
-        <w:t>;</w:t>
-      </w:r>
-    </w:p>
-    <w:p>
-      <w:pPr>
-        <w:rPr>
-          <w:rFonts w:ascii="Consolas" w:hAnsi="Consolas" w:cs="Consolas"/>
-          <w:lang w:val="en-US"/>
-        </w:rPr>
-      </w:pPr>
-      <w:r>
-        <w:rPr>
-          <w:rFonts w:ascii="Consolas" w:hAnsi="Consolas" w:cs="Consolas"/>
-          <w:lang w:val="en-US"/>
-        </w:rPr>
-        <w:tab/>
-      </w:r>
-    </w:p>
-    <w:p>
-      <w:pPr>
-        <w:rPr>
-          <w:rFonts w:ascii="Consolas" w:hAnsi="Consolas" w:cs="Consolas"/>
-          <w:lang w:val="en-US"/>
-        </w:rPr>
-      </w:pPr>
-      <w:r>
-        <w:rPr>
-          <w:rFonts w:ascii="Consolas" w:hAnsi="Consolas" w:cs="Consolas"/>
-          <w:lang w:val="en-US"/>
-        </w:rPr>
-        <w:tab/>
-        <w:t xml:space="preserve">//Ask for the </w:t>
-      </w:r>
-      <w:proofErr w:type="spellStart"/>
-      <w:r>
-        <w:rPr>
-          <w:rFonts w:ascii="Consolas" w:hAnsi="Consolas" w:cs="Consolas"/>
-          <w:lang w:val="en-US"/>
-        </w:rPr>
-        <w:t>minimumStock</w:t>
-      </w:r>
-      <w:proofErr w:type="spellEnd"/>
-    </w:p>
-    <w:p>
-      <w:pPr>
-        <w:rPr>
-          <w:rFonts w:ascii="Consolas" w:hAnsi="Consolas" w:cs="Consolas"/>
-          <w:lang w:val="en-US"/>
-        </w:rPr>
-      </w:pPr>
-      <w:r>
-        <w:rPr>
-          <w:rFonts w:ascii="Consolas" w:hAnsi="Consolas" w:cs="Consolas"/>
-          <w:lang w:val="en-US"/>
-        </w:rPr>
-        <w:tab/>
-      </w:r>
-      <w:proofErr w:type="spellStart"/>
-      <w:r>
-        <w:rPr>
-          <w:rFonts w:ascii="Consolas" w:hAnsi="Consolas" w:cs="Consolas"/>
-          <w:lang w:val="en-US"/>
-        </w:rPr>
-        <w:t>Escribir</w:t>
-      </w:r>
-      <w:proofErr w:type="spellEnd"/>
-      <w:r>
-        <w:rPr>
-          <w:rFonts w:ascii="Consolas" w:hAnsi="Consolas" w:cs="Consolas"/>
-          <w:lang w:val="en-US"/>
-        </w:rPr>
-        <w:t xml:space="preserve"> "What is the </w:t>
-      </w:r>
-      <w:proofErr w:type="spellStart"/>
-      <w:r>
-        <w:rPr>
-          <w:rFonts w:ascii="Consolas" w:hAnsi="Consolas" w:cs="Consolas"/>
-          <w:lang w:val="en-US"/>
-        </w:rPr>
-        <w:t>minimun</w:t>
-      </w:r>
-      <w:proofErr w:type="spellEnd"/>
-      <w:r>
-        <w:rPr>
-          <w:rFonts w:ascii="Consolas" w:hAnsi="Consolas" w:cs="Consolas"/>
-          <w:lang w:val="en-US"/>
-        </w:rPr>
-        <w:t xml:space="preserve"> stock for the " + </w:t>
-      </w:r>
-      <w:proofErr w:type="spellStart"/>
-      <w:r>
-        <w:rPr>
-          <w:rFonts w:ascii="Consolas" w:hAnsi="Consolas" w:cs="Consolas"/>
-          <w:lang w:val="en-US"/>
-        </w:rPr>
-        <w:t>nameProduct</w:t>
-      </w:r>
-      <w:proofErr w:type="spellEnd"/>
-      <w:r>
-        <w:rPr>
-          <w:rFonts w:ascii="Consolas" w:hAnsi="Consolas" w:cs="Consolas"/>
-          <w:lang w:val="en-US"/>
-        </w:rPr>
-        <w:t xml:space="preserve"> + "?";</w:t>
-      </w:r>
-    </w:p>
-    <w:p>
-      <w:pPr>
-        <w:rPr>
-          <w:rFonts w:ascii="Consolas" w:hAnsi="Consolas" w:cs="Consolas"/>
-          <w:lang w:val="en-US"/>
-        </w:rPr>
-      </w:pPr>
-      <w:r>
-        <w:rPr>
-          <w:rFonts w:ascii="Consolas" w:hAnsi="Consolas" w:cs="Consolas"/>
-          <w:lang w:val="en-US"/>
-        </w:rPr>
-        <w:tab/>
-        <w:t xml:space="preserve">Leer </w:t>
-      </w:r>
-      <w:proofErr w:type="spellStart"/>
-      <w:r>
-        <w:rPr>
-          <w:rFonts w:ascii="Consolas" w:hAnsi="Consolas" w:cs="Consolas"/>
-          <w:lang w:val="en-US"/>
-        </w:rPr>
-        <w:t>minimumStock</w:t>
-      </w:r>
-      <w:proofErr w:type="spellEnd"/>
-      <w:r>
-        <w:rPr>
-          <w:rFonts w:ascii="Consolas" w:hAnsi="Consolas" w:cs="Consolas"/>
-          <w:lang w:val="en-US"/>
-        </w:rPr>
-        <w:t>;</w:t>
-      </w:r>
-    </w:p>
-    <w:p>
-      <w:pPr>
-        <w:rPr>
-          <w:rFonts w:ascii="Consolas" w:hAnsi="Consolas" w:cs="Consolas"/>
-          <w:lang w:val="en-US"/>
-        </w:rPr>
-      </w:pPr>
-      <w:r>
-        <w:rPr>
-          <w:rFonts w:ascii="Consolas" w:hAnsi="Consolas" w:cs="Consolas"/>
-          <w:lang w:val="en-US"/>
-        </w:rPr>
-        <w:tab/>
-      </w:r>
-    </w:p>
-    <w:p>
-      <w:pPr>
-        <w:rPr>
-          <w:rFonts w:ascii="Consolas" w:hAnsi="Consolas" w:cs="Consolas"/>
-          <w:lang w:val="en-US"/>
-        </w:rPr>
-      </w:pPr>
-      <w:r>
-        <w:rPr>
-          <w:rFonts w:ascii="Consolas" w:hAnsi="Consolas" w:cs="Consolas"/>
-          <w:lang w:val="en-US"/>
-        </w:rPr>
-        <w:tab/>
-        <w:t xml:space="preserve">//Ask for the </w:t>
-      </w:r>
-      <w:proofErr w:type="spellStart"/>
-      <w:r>
-        <w:rPr>
-          <w:rFonts w:ascii="Consolas" w:hAnsi="Consolas" w:cs="Consolas"/>
-          <w:lang w:val="en-US"/>
-        </w:rPr>
-        <w:t>maximumStock</w:t>
-      </w:r>
-      <w:proofErr w:type="spellEnd"/>
-    </w:p>
-    <w:p>
-      <w:pPr>
-        <w:rPr>
-          <w:rFonts w:ascii="Consolas" w:hAnsi="Consolas" w:cs="Consolas"/>
-          <w:lang w:val="en-US"/>
-        </w:rPr>
-      </w:pPr>
-      <w:r>
-        <w:rPr>
-          <w:rFonts w:ascii="Consolas" w:hAnsi="Consolas" w:cs="Consolas"/>
-          <w:lang w:val="en-US"/>
-        </w:rPr>
-        <w:tab/>
-      </w:r>
-      <w:proofErr w:type="spellStart"/>
-      <w:r>
-        <w:rPr>
-          <w:rFonts w:ascii="Consolas" w:hAnsi="Consolas" w:cs="Consolas"/>
-          <w:lang w:val="en-US"/>
-        </w:rPr>
-        <w:t>Escribir</w:t>
-      </w:r>
-      <w:proofErr w:type="spellEnd"/>
-      <w:r>
-        <w:rPr>
-          <w:rFonts w:ascii="Consolas" w:hAnsi="Consolas" w:cs="Consolas"/>
-          <w:lang w:val="en-US"/>
-        </w:rPr>
-        <w:t xml:space="preserve"> "What is the </w:t>
-      </w:r>
-      <w:proofErr w:type="spellStart"/>
-      <w:r>
-        <w:rPr>
-          <w:rFonts w:ascii="Consolas" w:hAnsi="Consolas" w:cs="Consolas"/>
-          <w:lang w:val="en-US"/>
-        </w:rPr>
-        <w:t>maximun</w:t>
-      </w:r>
-      <w:proofErr w:type="spellEnd"/>
-      <w:r>
-        <w:rPr>
-          <w:rFonts w:ascii="Consolas" w:hAnsi="Consolas" w:cs="Consolas"/>
-          <w:lang w:val="en-US"/>
-        </w:rPr>
-        <w:t xml:space="preserve"> stock for the "+ </w:t>
-      </w:r>
-      <w:proofErr w:type="spellStart"/>
-      <w:r>
-        <w:rPr>
-          <w:rFonts w:ascii="Consolas" w:hAnsi="Consolas" w:cs="Consolas"/>
-          <w:lang w:val="en-US"/>
-        </w:rPr>
-        <w:t>nameProduct</w:t>
-      </w:r>
-      <w:proofErr w:type="spellEnd"/>
-      <w:r>
-        <w:rPr>
-          <w:rFonts w:ascii="Consolas" w:hAnsi="Consolas" w:cs="Consolas"/>
-          <w:lang w:val="en-US"/>
-        </w:rPr>
-        <w:t xml:space="preserve"> + "?";</w:t>
-      </w:r>
-    </w:p>
-    <w:p>
-      <w:pPr>
-        <w:rPr>
-          <w:rFonts w:ascii="Consolas" w:hAnsi="Consolas" w:cs="Consolas"/>
-          <w:lang w:val="en-US"/>
-        </w:rPr>
-      </w:pPr>
-      <w:r>
-        <w:rPr>
-          <w:rFonts w:ascii="Consolas" w:hAnsi="Consolas" w:cs="Consolas"/>
-          <w:lang w:val="en-US"/>
-        </w:rPr>
-        <w:tab/>
-        <w:t xml:space="preserve">Leer </w:t>
-      </w:r>
-      <w:proofErr w:type="spellStart"/>
-      <w:r>
-        <w:rPr>
-          <w:rFonts w:ascii="Consolas" w:hAnsi="Consolas" w:cs="Consolas"/>
-          <w:lang w:val="en-US"/>
-        </w:rPr>
-        <w:t>maximumStock</w:t>
-      </w:r>
-      <w:proofErr w:type="spellEnd"/>
-      <w:r>
-        <w:rPr>
-          <w:rFonts w:ascii="Consolas" w:hAnsi="Consolas" w:cs="Consolas"/>
-          <w:lang w:val="en-US"/>
-        </w:rPr>
-        <w:t>;</w:t>
-      </w:r>
-    </w:p>
-    <w:p>
-      <w:pPr>
-        <w:rPr>
-          <w:rFonts w:ascii="Consolas" w:hAnsi="Consolas" w:cs="Consolas"/>
-          <w:lang w:val="en-US"/>
-        </w:rPr>
-      </w:pPr>
-      <w:r>
-        <w:rPr>
-          <w:rFonts w:ascii="Consolas" w:hAnsi="Consolas" w:cs="Consolas"/>
-          <w:lang w:val="en-US"/>
-        </w:rPr>
-        <w:tab/>
-      </w:r>
-    </w:p>
-    <w:p>
-      <w:pPr>
-        <w:rPr>
-          <w:rFonts w:ascii="Consolas" w:hAnsi="Consolas" w:cs="Consolas"/>
-          <w:lang w:val="en-US"/>
-        </w:rPr>
-      </w:pPr>
-      <w:r>
-        <w:rPr>
-          <w:rFonts w:ascii="Consolas" w:hAnsi="Consolas" w:cs="Consolas"/>
-          <w:lang w:val="en-US"/>
-        </w:rPr>
-        <w:tab/>
-        <w:t>//Ask for the current stock</w:t>
-      </w:r>
-    </w:p>
-    <w:p>
-      <w:pPr>
-        <w:rPr>
-          <w:rFonts w:ascii="Consolas" w:hAnsi="Consolas" w:cs="Consolas"/>
-          <w:lang w:val="en-US"/>
-        </w:rPr>
-      </w:pPr>
-      <w:r>
-        <w:rPr>
-          <w:rFonts w:ascii="Consolas" w:hAnsi="Consolas" w:cs="Consolas"/>
-          <w:lang w:val="en-US"/>
-        </w:rPr>
-        <w:tab/>
-      </w:r>
-      <w:proofErr w:type="spellStart"/>
-      <w:r>
-        <w:rPr>
-          <w:rFonts w:ascii="Consolas" w:hAnsi="Consolas" w:cs="Consolas"/>
-          <w:lang w:val="en-US"/>
-        </w:rPr>
-        <w:t>Escribir</w:t>
-      </w:r>
-      <w:proofErr w:type="spellEnd"/>
-      <w:r>
-        <w:rPr>
-          <w:rFonts w:ascii="Consolas" w:hAnsi="Consolas" w:cs="Consolas"/>
-          <w:lang w:val="en-US"/>
-        </w:rPr>
-        <w:t xml:space="preserve"> "What is the current stock available of the "+ </w:t>
-      </w:r>
-      <w:proofErr w:type="spellStart"/>
-      <w:r>
-        <w:rPr>
-          <w:rFonts w:ascii="Consolas" w:hAnsi="Consolas" w:cs="Consolas"/>
-          <w:lang w:val="en-US"/>
-        </w:rPr>
-        <w:t>nameProduct</w:t>
-      </w:r>
-      <w:proofErr w:type="spellEnd"/>
-      <w:r>
-        <w:rPr>
-          <w:rFonts w:ascii="Consolas" w:hAnsi="Consolas" w:cs="Consolas"/>
-          <w:lang w:val="en-US"/>
-        </w:rPr>
-        <w:t xml:space="preserve"> + "?";</w:t>
-      </w:r>
-    </w:p>
-    <w:p>
-      <w:pPr>
-        <w:rPr>
-          <w:rFonts w:ascii="Consolas" w:hAnsi="Consolas" w:cs="Consolas"/>
-          <w:lang w:val="en-US"/>
-        </w:rPr>
-      </w:pPr>
-      <w:r>
-        <w:rPr>
-          <w:rFonts w:ascii="Consolas" w:hAnsi="Consolas" w:cs="Consolas"/>
-          <w:lang w:val="en-US"/>
-        </w:rPr>
-        <w:tab/>
-        <w:t xml:space="preserve">Leer </w:t>
-      </w:r>
-      <w:proofErr w:type="spellStart"/>
-      <w:r>
-        <w:rPr>
-          <w:rFonts w:ascii="Consolas" w:hAnsi="Consolas" w:cs="Consolas"/>
-          <w:lang w:val="en-US"/>
-        </w:rPr>
-        <w:t>currentStock</w:t>
-      </w:r>
-      <w:proofErr w:type="spellEnd"/>
-      <w:r>
-        <w:rPr>
-          <w:rFonts w:ascii="Consolas" w:hAnsi="Consolas" w:cs="Consolas"/>
-          <w:lang w:val="en-US"/>
-        </w:rPr>
-        <w:t>;</w:t>
-      </w:r>
-    </w:p>
-    <w:p>
-      <w:pPr>
-        <w:rPr>
-          <w:rFonts w:ascii="Consolas" w:hAnsi="Consolas" w:cs="Consolas"/>
-          <w:lang w:val="en-US"/>
-        </w:rPr>
-      </w:pPr>
-      <w:r>
-        <w:rPr>
-          <w:rFonts w:ascii="Consolas" w:hAnsi="Consolas" w:cs="Consolas"/>
-          <w:lang w:val="en-US"/>
-        </w:rPr>
-        <w:tab/>
-      </w:r>
-    </w:p>
-    <w:p>
-      <w:pPr>
-        <w:rPr>
-          <w:rFonts w:ascii="Consolas" w:hAnsi="Consolas" w:cs="Consolas"/>
-          <w:lang w:val="en-US"/>
-        </w:rPr>
-      </w:pPr>
-      <w:r>
-        <w:rPr>
-          <w:rFonts w:ascii="Consolas" w:hAnsi="Consolas" w:cs="Consolas"/>
-          <w:lang w:val="en-US"/>
-        </w:rPr>
-        <w:lastRenderedPageBreak/>
-        <w:tab/>
-        <w:t xml:space="preserve">//Compares if the </w:t>
-      </w:r>
-      <w:proofErr w:type="spellStart"/>
-      <w:r>
-        <w:rPr>
-          <w:rFonts w:ascii="Consolas" w:hAnsi="Consolas" w:cs="Consolas"/>
-          <w:lang w:val="en-US"/>
-        </w:rPr>
-        <w:t>currentStock</w:t>
-      </w:r>
-      <w:proofErr w:type="spellEnd"/>
-      <w:r>
-        <w:rPr>
-          <w:rFonts w:ascii="Consolas" w:hAnsi="Consolas" w:cs="Consolas"/>
-          <w:lang w:val="en-US"/>
-        </w:rPr>
-        <w:t xml:space="preserve"> is less than or equal to the minimum stock</w:t>
-      </w:r>
-    </w:p>
-    <w:p>
-      <w:pPr>
-        <w:rPr>
-          <w:rFonts w:ascii="Consolas" w:hAnsi="Consolas" w:cs="Consolas"/>
-          <w:lang w:val="en-US"/>
-        </w:rPr>
-      </w:pPr>
-      <w:r>
-        <w:rPr>
-          <w:rFonts w:ascii="Consolas" w:hAnsi="Consolas" w:cs="Consolas"/>
-          <w:lang w:val="en-US"/>
-        </w:rPr>
-        <w:tab/>
-        <w:t>//if not, returns false</w:t>
-      </w:r>
-    </w:p>
-    <w:p>
-      <w:pPr>
-        <w:rPr>
-          <w:rFonts w:ascii="Consolas" w:hAnsi="Consolas" w:cs="Consolas"/>
-          <w:lang w:val="en-US"/>
-        </w:rPr>
-      </w:pPr>
-      <w:r>
-        <w:rPr>
-          <w:rFonts w:ascii="Consolas" w:hAnsi="Consolas" w:cs="Consolas"/>
-          <w:lang w:val="en-US"/>
-        </w:rPr>
-        <w:tab/>
-      </w:r>
-      <w:proofErr w:type="spellStart"/>
-      <w:r>
-        <w:rPr>
-          <w:rFonts w:ascii="Consolas" w:hAnsi="Consolas" w:cs="Consolas"/>
-          <w:lang w:val="en-US"/>
-        </w:rPr>
-        <w:t>requiresAudit</w:t>
-      </w:r>
-      <w:proofErr w:type="spellEnd"/>
-      <w:r>
-        <w:rPr>
-          <w:rFonts w:ascii="Consolas" w:hAnsi="Consolas" w:cs="Consolas"/>
-          <w:lang w:val="en-US"/>
-        </w:rPr>
-        <w:t xml:space="preserve"> = </w:t>
-      </w:r>
-      <w:proofErr w:type="spellStart"/>
-      <w:r>
-        <w:rPr>
-          <w:rFonts w:ascii="Consolas" w:hAnsi="Consolas" w:cs="Consolas"/>
-          <w:lang w:val="en-US"/>
-        </w:rPr>
-        <w:t>currentStock</w:t>
-      </w:r>
-      <w:proofErr w:type="spellEnd"/>
-      <w:r>
-        <w:rPr>
-          <w:rFonts w:ascii="Consolas" w:hAnsi="Consolas" w:cs="Consolas"/>
-          <w:lang w:val="en-US"/>
-        </w:rPr>
-        <w:t xml:space="preserve"> &lt;= </w:t>
-      </w:r>
-      <w:proofErr w:type="spellStart"/>
-      <w:r>
-        <w:rPr>
-          <w:rFonts w:ascii="Consolas" w:hAnsi="Consolas" w:cs="Consolas"/>
-          <w:lang w:val="en-US"/>
-        </w:rPr>
-        <w:t>minimumStock</w:t>
-      </w:r>
-      <w:proofErr w:type="spellEnd"/>
-      <w:r>
-        <w:rPr>
-          <w:rFonts w:ascii="Consolas" w:hAnsi="Consolas" w:cs="Consolas"/>
-          <w:lang w:val="en-US"/>
-        </w:rPr>
-        <w:t>;</w:t>
-      </w:r>
-    </w:p>
-    <w:p>
-      <w:pPr>
-        <w:rPr>
-          <w:rFonts w:ascii="Consolas" w:hAnsi="Consolas" w:cs="Consolas"/>
-        </w:rPr>
-      </w:pPr>
-      <w:r>
-        <w:rPr>
-          <w:rFonts w:ascii="Consolas" w:hAnsi="Consolas" w:cs="Consolas"/>
-          <w:lang w:val="en-US"/>
-        </w:rPr>
-        <w:tab/>
-      </w:r>
-      <w:r>
-        <w:rPr>
-          <w:rFonts w:ascii="Consolas" w:hAnsi="Consolas" w:cs="Consolas"/>
-        </w:rPr>
-        <w:t xml:space="preserve">Escribir </w:t>
-      </w:r>
-      <w:proofErr w:type="spellStart"/>
-      <w:r>
-        <w:rPr>
-          <w:rFonts w:ascii="Consolas" w:hAnsi="Consolas" w:cs="Consolas"/>
-        </w:rPr>
-        <w:t>requiresAudit</w:t>
-      </w:r>
-      <w:proofErr w:type="spellEnd"/>
-      <w:r>
-        <w:rPr>
-          <w:rFonts w:ascii="Consolas" w:hAnsi="Consolas" w:cs="Consolas"/>
-        </w:rPr>
-        <w:t>;</w:t>
-      </w:r>
-    </w:p>
-    <w:p>
-      <w:pPr>
-        <w:rPr>
-          <w:rFonts w:ascii="Consolas" w:hAnsi="Consolas" w:cs="Consolas"/>
-        </w:rPr>
-      </w:pPr>
-      <w:r>
-        <w:rPr>
-          <w:rFonts w:ascii="Consolas" w:hAnsi="Consolas" w:cs="Consolas"/>
-        </w:rPr>
-        <w:tab/>
-      </w:r>
-    </w:p>
-    <w:p>
-      <w:pPr>
-        <w:rPr>
-          <w:rFonts w:ascii="Consolas" w:hAnsi="Consolas" w:cs="Consolas"/>
-        </w:rPr>
-      </w:pPr>
-      <w:proofErr w:type="spellStart"/>
-      <w:r>
-        <w:rPr>
-          <w:rFonts w:ascii="Consolas" w:hAnsi="Consolas" w:cs="Consolas"/>
-        </w:rPr>
-        <w:t>FinAlgoritmo</w:t>
       </w:r>
       <w:proofErr w:type="spellEnd"/>
     </w:p>
@@ -1331,7 +401,856 @@
         <w:ind w:left="708" w:hanging="708"/>
         <w:jc w:val="center"/>
         <w:rPr>
+          <w:rFonts w:ascii="Consolas" w:hAnsi="Consolas" w:cs="Consolas"/>
+          <w:lang w:val="en-US"/>
+        </w:rPr>
+      </w:pPr>
+      <w:r>
+        <w:rPr>
+          <w:rFonts w:ascii="Consolas" w:hAnsi="Consolas" w:cs="Consolas"/>
+          <w:lang w:val="en-US"/>
+        </w:rPr>
+        <w:tab/>
+        <w:t>// Variables to set the value of the stock</w:t>
+      </w:r>
+    </w:p>
+    <w:p>
+      <w:pPr>
+        <w:ind w:left="708" w:hanging="708"/>
+        <w:jc w:val="center"/>
+        <w:rPr>
+          <w:rFonts w:ascii="Consolas" w:hAnsi="Consolas" w:cs="Consolas"/>
+          <w:lang w:val="en-US"/>
+        </w:rPr>
+      </w:pPr>
+      <w:r>
+        <w:rPr>
+          <w:rFonts w:ascii="Consolas" w:hAnsi="Consolas" w:cs="Consolas"/>
+          <w:lang w:val="en-US"/>
+        </w:rPr>
+        <w:tab/>
+      </w:r>
+      <w:proofErr w:type="spellStart"/>
+      <w:r>
+        <w:rPr>
+          <w:rFonts w:ascii="Consolas" w:hAnsi="Consolas" w:cs="Consolas"/>
+          <w:lang w:val="en-US"/>
+        </w:rPr>
+        <w:t>Definir</w:t>
+      </w:r>
+      <w:proofErr w:type="spellEnd"/>
+      <w:r>
+        <w:rPr>
+          <w:rFonts w:ascii="Consolas" w:hAnsi="Consolas" w:cs="Consolas"/>
+          <w:lang w:val="en-US"/>
+        </w:rPr>
+        <w:t xml:space="preserve"> </w:t>
+      </w:r>
+      <w:proofErr w:type="spellStart"/>
+      <w:r>
+        <w:rPr>
+          <w:rFonts w:ascii="Consolas" w:hAnsi="Consolas" w:cs="Consolas"/>
+          <w:lang w:val="en-US"/>
+        </w:rPr>
+        <w:t>currentStock</w:t>
+      </w:r>
+      <w:proofErr w:type="spellEnd"/>
+      <w:r>
+        <w:rPr>
+          <w:rFonts w:ascii="Consolas" w:hAnsi="Consolas" w:cs="Consolas"/>
+          <w:lang w:val="en-US"/>
+        </w:rPr>
+        <w:t xml:space="preserve">, </w:t>
+      </w:r>
+      <w:proofErr w:type="spellStart"/>
+      <w:r>
+        <w:rPr>
+          <w:rFonts w:ascii="Consolas" w:hAnsi="Consolas" w:cs="Consolas"/>
+          <w:lang w:val="en-US"/>
+        </w:rPr>
+        <w:t>minimumStock</w:t>
+      </w:r>
+      <w:proofErr w:type="spellEnd"/>
+      <w:r>
+        <w:rPr>
+          <w:rFonts w:ascii="Consolas" w:hAnsi="Consolas" w:cs="Consolas"/>
+          <w:lang w:val="en-US"/>
+        </w:rPr>
+        <w:t xml:space="preserve">, </w:t>
+      </w:r>
+      <w:proofErr w:type="spellStart"/>
+      <w:r>
+        <w:rPr>
+          <w:rFonts w:ascii="Consolas" w:hAnsi="Consolas" w:cs="Consolas"/>
+          <w:lang w:val="en-US"/>
+        </w:rPr>
+        <w:t>maximumStock</w:t>
+      </w:r>
+      <w:proofErr w:type="spellEnd"/>
+      <w:r>
+        <w:rPr>
+          <w:rFonts w:ascii="Consolas" w:hAnsi="Consolas" w:cs="Consolas"/>
+          <w:lang w:val="en-US"/>
+        </w:rPr>
+        <w:t xml:space="preserve"> Como Real</w:t>
+      </w:r>
+    </w:p>
+    <w:p>
+      <w:pPr>
+        <w:ind w:left="708" w:hanging="708"/>
+        <w:jc w:val="center"/>
+        <w:rPr>
+          <w:rFonts w:ascii="Consolas" w:hAnsi="Consolas" w:cs="Consolas"/>
+          <w:lang w:val="en-US"/>
+        </w:rPr>
+      </w:pPr>
+      <w:r>
+        <w:rPr>
+          <w:rFonts w:ascii="Consolas" w:hAnsi="Consolas" w:cs="Consolas"/>
+          <w:lang w:val="en-US"/>
+        </w:rPr>
+        <w:tab/>
+        <w:t>// Variable to store the name of the product</w:t>
+      </w:r>
+    </w:p>
+    <w:p>
+      <w:pPr>
+        <w:ind w:left="708" w:hanging="708"/>
+        <w:jc w:val="center"/>
+        <w:rPr>
+          <w:rFonts w:ascii="Consolas" w:hAnsi="Consolas" w:cs="Consolas"/>
+          <w:lang w:val="en-US"/>
+        </w:rPr>
+      </w:pPr>
+      <w:r>
+        <w:rPr>
+          <w:rFonts w:ascii="Consolas" w:hAnsi="Consolas" w:cs="Consolas"/>
+          <w:lang w:val="en-US"/>
+        </w:rPr>
+        <w:tab/>
+      </w:r>
+      <w:proofErr w:type="spellStart"/>
+      <w:r>
+        <w:rPr>
+          <w:rFonts w:ascii="Consolas" w:hAnsi="Consolas" w:cs="Consolas"/>
+          <w:lang w:val="en-US"/>
+        </w:rPr>
+        <w:t>Definir</w:t>
+      </w:r>
+      <w:proofErr w:type="spellEnd"/>
+      <w:r>
+        <w:rPr>
+          <w:rFonts w:ascii="Consolas" w:hAnsi="Consolas" w:cs="Consolas"/>
+          <w:lang w:val="en-US"/>
+        </w:rPr>
+        <w:t xml:space="preserve"> </w:t>
+      </w:r>
+      <w:proofErr w:type="spellStart"/>
+      <w:r>
+        <w:rPr>
+          <w:rFonts w:ascii="Consolas" w:hAnsi="Consolas" w:cs="Consolas"/>
+          <w:lang w:val="en-US"/>
+        </w:rPr>
+        <w:t>nameProduct</w:t>
+      </w:r>
+      <w:proofErr w:type="spellEnd"/>
+      <w:r>
+        <w:rPr>
+          <w:rFonts w:ascii="Consolas" w:hAnsi="Consolas" w:cs="Consolas"/>
+          <w:lang w:val="en-US"/>
+        </w:rPr>
+        <w:t xml:space="preserve"> Como Cadena</w:t>
+      </w:r>
+    </w:p>
+    <w:p>
+      <w:pPr>
+        <w:ind w:left="708" w:hanging="708"/>
+        <w:jc w:val="center"/>
+        <w:rPr>
+          <w:rFonts w:ascii="Consolas" w:hAnsi="Consolas" w:cs="Consolas"/>
+          <w:lang w:val="en-US"/>
+        </w:rPr>
+      </w:pPr>
+      <w:r>
+        <w:rPr>
+          <w:rFonts w:ascii="Consolas" w:hAnsi="Consolas" w:cs="Consolas"/>
+          <w:lang w:val="en-US"/>
+        </w:rPr>
+        <w:tab/>
+        <w:t>// Variable to verify if the product requires an audit</w:t>
+      </w:r>
+    </w:p>
+    <w:p>
+      <w:pPr>
+        <w:ind w:left="708" w:hanging="708"/>
+        <w:jc w:val="center"/>
+        <w:rPr>
+          <w:rFonts w:ascii="Consolas" w:hAnsi="Consolas" w:cs="Consolas"/>
+          <w:lang w:val="en-US"/>
+        </w:rPr>
+      </w:pPr>
+      <w:r>
+        <w:rPr>
+          <w:rFonts w:ascii="Consolas" w:hAnsi="Consolas" w:cs="Consolas"/>
+          <w:lang w:val="en-US"/>
+        </w:rPr>
+        <w:tab/>
+      </w:r>
+      <w:proofErr w:type="spellStart"/>
+      <w:r>
+        <w:rPr>
+          <w:rFonts w:ascii="Consolas" w:hAnsi="Consolas" w:cs="Consolas"/>
+          <w:lang w:val="en-US"/>
+        </w:rPr>
+        <w:t>Definir</w:t>
+      </w:r>
+      <w:proofErr w:type="spellEnd"/>
+      <w:r>
+        <w:rPr>
+          <w:rFonts w:ascii="Consolas" w:hAnsi="Consolas" w:cs="Consolas"/>
+          <w:lang w:val="en-US"/>
+        </w:rPr>
+        <w:t xml:space="preserve"> </w:t>
+      </w:r>
+      <w:proofErr w:type="spellStart"/>
+      <w:r>
+        <w:rPr>
+          <w:rFonts w:ascii="Consolas" w:hAnsi="Consolas" w:cs="Consolas"/>
+          <w:lang w:val="en-US"/>
+        </w:rPr>
+        <w:t>requiresAudit</w:t>
+      </w:r>
+      <w:proofErr w:type="spellEnd"/>
+      <w:r>
+        <w:rPr>
+          <w:rFonts w:ascii="Consolas" w:hAnsi="Consolas" w:cs="Consolas"/>
+          <w:lang w:val="en-US"/>
+        </w:rPr>
+        <w:t xml:space="preserve"> Como </w:t>
+      </w:r>
+      <w:proofErr w:type="spellStart"/>
+      <w:r>
+        <w:rPr>
+          <w:rFonts w:ascii="Consolas" w:hAnsi="Consolas" w:cs="Consolas"/>
+          <w:lang w:val="en-US"/>
+        </w:rPr>
+        <w:t>Lógico</w:t>
+      </w:r>
+      <w:proofErr w:type="spellEnd"/>
+    </w:p>
+    <w:p>
+      <w:pPr>
+        <w:ind w:left="708" w:hanging="708"/>
+        <w:jc w:val="center"/>
+        <w:rPr>
+          <w:rFonts w:ascii="Consolas" w:hAnsi="Consolas" w:cs="Consolas"/>
+          <w:lang w:val="en-US"/>
+        </w:rPr>
+      </w:pPr>
+      <w:r>
+        <w:rPr>
+          <w:rFonts w:ascii="Consolas" w:hAnsi="Consolas" w:cs="Consolas"/>
+          <w:lang w:val="en-US"/>
+        </w:rPr>
+        <w:tab/>
+        <w:t>// Ask for the product name and store it</w:t>
+      </w:r>
+    </w:p>
+    <w:p>
+      <w:pPr>
+        <w:ind w:left="708" w:hanging="708"/>
+        <w:jc w:val="center"/>
+        <w:rPr>
+          <w:rFonts w:ascii="Consolas" w:hAnsi="Consolas" w:cs="Consolas"/>
+          <w:lang w:val="en-US"/>
+        </w:rPr>
+      </w:pPr>
+      <w:r>
+        <w:rPr>
+          <w:rFonts w:ascii="Consolas" w:hAnsi="Consolas" w:cs="Consolas"/>
+          <w:lang w:val="en-US"/>
+        </w:rPr>
+        <w:tab/>
+      </w:r>
+      <w:proofErr w:type="spellStart"/>
+      <w:r>
+        <w:rPr>
+          <w:rFonts w:ascii="Consolas" w:hAnsi="Consolas" w:cs="Consolas"/>
+          <w:lang w:val="en-US"/>
+        </w:rPr>
+        <w:t>Escribir</w:t>
+      </w:r>
+      <w:proofErr w:type="spellEnd"/>
+      <w:r>
+        <w:rPr>
+          <w:rFonts w:ascii="Consolas" w:hAnsi="Consolas" w:cs="Consolas"/>
+          <w:lang w:val="en-US"/>
+        </w:rPr>
+        <w:t xml:space="preserve"> 'What is the name of the product'</w:t>
+      </w:r>
+    </w:p>
+    <w:p>
+      <w:pPr>
+        <w:ind w:left="708" w:hanging="708"/>
+        <w:jc w:val="center"/>
+        <w:rPr>
+          <w:rFonts w:ascii="Consolas" w:hAnsi="Consolas" w:cs="Consolas"/>
+          <w:lang w:val="en-US"/>
+        </w:rPr>
+      </w:pPr>
+      <w:r>
+        <w:rPr>
+          <w:rFonts w:ascii="Consolas" w:hAnsi="Consolas" w:cs="Consolas"/>
+          <w:lang w:val="en-US"/>
+        </w:rPr>
+        <w:tab/>
+        <w:t xml:space="preserve">Leer </w:t>
+      </w:r>
+      <w:proofErr w:type="spellStart"/>
+      <w:r>
+        <w:rPr>
+          <w:rFonts w:ascii="Consolas" w:hAnsi="Consolas" w:cs="Consolas"/>
+          <w:lang w:val="en-US"/>
+        </w:rPr>
+        <w:t>nameProduct</w:t>
+      </w:r>
+      <w:proofErr w:type="spellEnd"/>
+    </w:p>
+    <w:p>
+      <w:pPr>
+        <w:ind w:left="708" w:hanging="708"/>
+        <w:jc w:val="center"/>
+        <w:rPr>
+          <w:rFonts w:ascii="Consolas" w:hAnsi="Consolas" w:cs="Consolas"/>
+          <w:lang w:val="en-US"/>
+        </w:rPr>
+      </w:pPr>
+      <w:r>
+        <w:rPr>
+          <w:rFonts w:ascii="Consolas" w:hAnsi="Consolas" w:cs="Consolas"/>
+          <w:lang w:val="en-US"/>
+        </w:rPr>
+        <w:tab/>
+        <w:t xml:space="preserve">// Ask for the </w:t>
+      </w:r>
+      <w:proofErr w:type="spellStart"/>
+      <w:r>
+        <w:rPr>
+          <w:rFonts w:ascii="Consolas" w:hAnsi="Consolas" w:cs="Consolas"/>
+          <w:lang w:val="en-US"/>
+        </w:rPr>
+        <w:t>minimumStock</w:t>
+      </w:r>
+      <w:proofErr w:type="spellEnd"/>
+    </w:p>
+    <w:p>
+      <w:pPr>
+        <w:ind w:left="708" w:hanging="708"/>
+        <w:jc w:val="center"/>
+        <w:rPr>
+          <w:rFonts w:ascii="Consolas" w:hAnsi="Consolas" w:cs="Consolas"/>
+          <w:lang w:val="en-US"/>
+        </w:rPr>
+      </w:pPr>
+      <w:r>
+        <w:rPr>
+          <w:rFonts w:ascii="Consolas" w:hAnsi="Consolas" w:cs="Consolas"/>
+          <w:lang w:val="en-US"/>
+        </w:rPr>
+        <w:tab/>
+      </w:r>
+      <w:proofErr w:type="spellStart"/>
+      <w:r>
+        <w:rPr>
+          <w:rFonts w:ascii="Consolas" w:hAnsi="Consolas" w:cs="Consolas"/>
+          <w:lang w:val="en-US"/>
+        </w:rPr>
+        <w:t>Escribir</w:t>
+      </w:r>
+      <w:proofErr w:type="spellEnd"/>
+      <w:r>
+        <w:rPr>
+          <w:rFonts w:ascii="Consolas" w:hAnsi="Consolas" w:cs="Consolas"/>
+          <w:lang w:val="en-US"/>
+        </w:rPr>
+        <w:t xml:space="preserve"> 'What is the </w:t>
+      </w:r>
+      <w:proofErr w:type="spellStart"/>
+      <w:r>
+        <w:rPr>
+          <w:rFonts w:ascii="Consolas" w:hAnsi="Consolas" w:cs="Consolas"/>
+          <w:lang w:val="en-US"/>
+        </w:rPr>
+        <w:t>minimun</w:t>
+      </w:r>
+      <w:proofErr w:type="spellEnd"/>
+      <w:r>
+        <w:rPr>
+          <w:rFonts w:ascii="Consolas" w:hAnsi="Consolas" w:cs="Consolas"/>
+          <w:lang w:val="en-US"/>
+        </w:rPr>
+        <w:t xml:space="preserve"> stock for the '+</w:t>
+      </w:r>
+      <w:proofErr w:type="spellStart"/>
+      <w:r>
+        <w:rPr>
+          <w:rFonts w:ascii="Consolas" w:hAnsi="Consolas" w:cs="Consolas"/>
+          <w:lang w:val="en-US"/>
+        </w:rPr>
+        <w:t>nameProduct</w:t>
+      </w:r>
+      <w:proofErr w:type="spellEnd"/>
+      <w:r>
+        <w:rPr>
+          <w:rFonts w:ascii="Consolas" w:hAnsi="Consolas" w:cs="Consolas"/>
+          <w:lang w:val="en-US"/>
+        </w:rPr>
+        <w:t>+'?'</w:t>
+      </w:r>
+    </w:p>
+    <w:p>
+      <w:pPr>
+        <w:ind w:left="708" w:hanging="708"/>
+        <w:jc w:val="center"/>
+        <w:rPr>
+          <w:rFonts w:ascii="Consolas" w:hAnsi="Consolas" w:cs="Consolas"/>
+          <w:lang w:val="en-US"/>
+        </w:rPr>
+      </w:pPr>
+      <w:r>
+        <w:rPr>
+          <w:rFonts w:ascii="Consolas" w:hAnsi="Consolas" w:cs="Consolas"/>
+          <w:lang w:val="en-US"/>
+        </w:rPr>
+        <w:tab/>
+        <w:t xml:space="preserve">Leer </w:t>
+      </w:r>
+      <w:proofErr w:type="spellStart"/>
+      <w:r>
+        <w:rPr>
+          <w:rFonts w:ascii="Consolas" w:hAnsi="Consolas" w:cs="Consolas"/>
+          <w:lang w:val="en-US"/>
+        </w:rPr>
+        <w:t>minimumStock</w:t>
+      </w:r>
+      <w:proofErr w:type="spellEnd"/>
+    </w:p>
+    <w:p>
+      <w:pPr>
+        <w:ind w:left="708" w:hanging="708"/>
+        <w:jc w:val="center"/>
+        <w:rPr>
+          <w:rFonts w:ascii="Consolas" w:hAnsi="Consolas" w:cs="Consolas"/>
+          <w:lang w:val="en-US"/>
+        </w:rPr>
+      </w:pPr>
+      <w:r>
+        <w:rPr>
+          <w:rFonts w:ascii="Consolas" w:hAnsi="Consolas" w:cs="Consolas"/>
+          <w:lang w:val="en-US"/>
+        </w:rPr>
+        <w:tab/>
+        <w:t xml:space="preserve">// Ask for the </w:t>
+      </w:r>
+      <w:proofErr w:type="spellStart"/>
+      <w:r>
+        <w:rPr>
+          <w:rFonts w:ascii="Consolas" w:hAnsi="Consolas" w:cs="Consolas"/>
+          <w:lang w:val="en-US"/>
+        </w:rPr>
+        <w:t>maximumStock</w:t>
+      </w:r>
+      <w:proofErr w:type="spellEnd"/>
+    </w:p>
+    <w:p>
+      <w:pPr>
+        <w:ind w:left="708" w:hanging="708"/>
+        <w:jc w:val="center"/>
+        <w:rPr>
+          <w:rFonts w:ascii="Consolas" w:hAnsi="Consolas" w:cs="Consolas"/>
+          <w:lang w:val="en-US"/>
+        </w:rPr>
+      </w:pPr>
+      <w:r>
+        <w:rPr>
+          <w:rFonts w:ascii="Consolas" w:hAnsi="Consolas" w:cs="Consolas"/>
+          <w:lang w:val="en-US"/>
+        </w:rPr>
+        <w:tab/>
+      </w:r>
+      <w:proofErr w:type="spellStart"/>
+      <w:r>
+        <w:rPr>
+          <w:rFonts w:ascii="Consolas" w:hAnsi="Consolas" w:cs="Consolas"/>
+          <w:lang w:val="en-US"/>
+        </w:rPr>
+        <w:t>Escribir</w:t>
+      </w:r>
+      <w:proofErr w:type="spellEnd"/>
+      <w:r>
+        <w:rPr>
+          <w:rFonts w:ascii="Consolas" w:hAnsi="Consolas" w:cs="Consolas"/>
+          <w:lang w:val="en-US"/>
+        </w:rPr>
+        <w:t xml:space="preserve"> 'What is the </w:t>
+      </w:r>
+      <w:proofErr w:type="spellStart"/>
+      <w:r>
+        <w:rPr>
+          <w:rFonts w:ascii="Consolas" w:hAnsi="Consolas" w:cs="Consolas"/>
+          <w:lang w:val="en-US"/>
+        </w:rPr>
+        <w:t>maximun</w:t>
+      </w:r>
+      <w:proofErr w:type="spellEnd"/>
+      <w:r>
+        <w:rPr>
+          <w:rFonts w:ascii="Consolas" w:hAnsi="Consolas" w:cs="Consolas"/>
+          <w:lang w:val="en-US"/>
+        </w:rPr>
+        <w:t xml:space="preserve"> stock for the '+</w:t>
+      </w:r>
+      <w:proofErr w:type="spellStart"/>
+      <w:r>
+        <w:rPr>
+          <w:rFonts w:ascii="Consolas" w:hAnsi="Consolas" w:cs="Consolas"/>
+          <w:lang w:val="en-US"/>
+        </w:rPr>
+        <w:t>nameProduct</w:t>
+      </w:r>
+      <w:proofErr w:type="spellEnd"/>
+      <w:r>
+        <w:rPr>
+          <w:rFonts w:ascii="Consolas" w:hAnsi="Consolas" w:cs="Consolas"/>
+          <w:lang w:val="en-US"/>
+        </w:rPr>
+        <w:t>+'?'</w:t>
+      </w:r>
+    </w:p>
+    <w:p>
+      <w:pPr>
+        <w:ind w:left="708" w:hanging="708"/>
+        <w:jc w:val="center"/>
+        <w:rPr>
+          <w:rFonts w:ascii="Consolas" w:hAnsi="Consolas" w:cs="Consolas"/>
+          <w:lang w:val="en-US"/>
+        </w:rPr>
+      </w:pPr>
+      <w:r>
+        <w:rPr>
+          <w:rFonts w:ascii="Consolas" w:hAnsi="Consolas" w:cs="Consolas"/>
+          <w:lang w:val="en-US"/>
+        </w:rPr>
+        <w:tab/>
+        <w:t xml:space="preserve">Leer </w:t>
+      </w:r>
+      <w:proofErr w:type="spellStart"/>
+      <w:r>
+        <w:rPr>
+          <w:rFonts w:ascii="Consolas" w:hAnsi="Consolas" w:cs="Consolas"/>
+          <w:lang w:val="en-US"/>
+        </w:rPr>
+        <w:t>maximumStock</w:t>
+      </w:r>
+      <w:proofErr w:type="spellEnd"/>
+    </w:p>
+    <w:p>
+      <w:pPr>
+        <w:ind w:left="708" w:hanging="708"/>
+        <w:jc w:val="center"/>
+        <w:rPr>
+          <w:rFonts w:ascii="Consolas" w:hAnsi="Consolas" w:cs="Consolas"/>
+          <w:lang w:val="en-US"/>
+        </w:rPr>
+      </w:pPr>
+      <w:r>
+        <w:rPr>
+          <w:rFonts w:ascii="Consolas" w:hAnsi="Consolas" w:cs="Consolas"/>
+          <w:lang w:val="en-US"/>
+        </w:rPr>
+        <w:tab/>
+        <w:t>// Ask for the current stock</w:t>
+      </w:r>
+    </w:p>
+    <w:p>
+      <w:pPr>
+        <w:ind w:left="708" w:hanging="708"/>
+        <w:jc w:val="center"/>
+        <w:rPr>
+          <w:rFonts w:ascii="Consolas" w:hAnsi="Consolas" w:cs="Consolas"/>
+          <w:lang w:val="en-US"/>
+        </w:rPr>
+      </w:pPr>
+      <w:r>
+        <w:rPr>
+          <w:rFonts w:ascii="Consolas" w:hAnsi="Consolas" w:cs="Consolas"/>
+          <w:lang w:val="en-US"/>
+        </w:rPr>
+        <w:tab/>
+      </w:r>
+      <w:proofErr w:type="spellStart"/>
+      <w:r>
+        <w:rPr>
+          <w:rFonts w:ascii="Consolas" w:hAnsi="Consolas" w:cs="Consolas"/>
+          <w:lang w:val="en-US"/>
+        </w:rPr>
+        <w:t>Escribir</w:t>
+      </w:r>
+      <w:proofErr w:type="spellEnd"/>
+      <w:r>
+        <w:rPr>
+          <w:rFonts w:ascii="Consolas" w:hAnsi="Consolas" w:cs="Consolas"/>
+          <w:lang w:val="en-US"/>
+        </w:rPr>
+        <w:t xml:space="preserve"> 'What is the current stock available of the '+</w:t>
+      </w:r>
+      <w:proofErr w:type="spellStart"/>
+      <w:r>
+        <w:rPr>
+          <w:rFonts w:ascii="Consolas" w:hAnsi="Consolas" w:cs="Consolas"/>
+          <w:lang w:val="en-US"/>
+        </w:rPr>
+        <w:t>nameProduct</w:t>
+      </w:r>
+      <w:proofErr w:type="spellEnd"/>
+      <w:r>
+        <w:rPr>
+          <w:rFonts w:ascii="Consolas" w:hAnsi="Consolas" w:cs="Consolas"/>
+          <w:lang w:val="en-US"/>
+        </w:rPr>
+        <w:t>+'?'</w:t>
+      </w:r>
+    </w:p>
+    <w:p>
+      <w:pPr>
+        <w:ind w:left="708" w:hanging="708"/>
+        <w:jc w:val="center"/>
+        <w:rPr>
+          <w:rFonts w:ascii="Consolas" w:hAnsi="Consolas" w:cs="Consolas"/>
+          <w:lang w:val="en-US"/>
+        </w:rPr>
+      </w:pPr>
+      <w:r>
+        <w:rPr>
+          <w:rFonts w:ascii="Consolas" w:hAnsi="Consolas" w:cs="Consolas"/>
+          <w:lang w:val="en-US"/>
+        </w:rPr>
+        <w:tab/>
+        <w:t xml:space="preserve">Leer </w:t>
+      </w:r>
+      <w:proofErr w:type="spellStart"/>
+      <w:r>
+        <w:rPr>
+          <w:rFonts w:ascii="Consolas" w:hAnsi="Consolas" w:cs="Consolas"/>
+          <w:lang w:val="en-US"/>
+        </w:rPr>
+        <w:t>currentStock</w:t>
+      </w:r>
+      <w:proofErr w:type="spellEnd"/>
+    </w:p>
+    <w:p>
+      <w:pPr>
+        <w:ind w:left="708" w:hanging="708"/>
+        <w:jc w:val="center"/>
+        <w:rPr>
+          <w:rFonts w:ascii="Consolas" w:hAnsi="Consolas" w:cs="Consolas"/>
+          <w:lang w:val="en-US"/>
+        </w:rPr>
+      </w:pPr>
+      <w:r>
+        <w:rPr>
+          <w:rFonts w:ascii="Consolas" w:hAnsi="Consolas" w:cs="Consolas"/>
+          <w:lang w:val="en-US"/>
+        </w:rPr>
+        <w:tab/>
+        <w:t xml:space="preserve">// Compares if the </w:t>
+      </w:r>
+      <w:proofErr w:type="spellStart"/>
+      <w:r>
+        <w:rPr>
+          <w:rFonts w:ascii="Consolas" w:hAnsi="Consolas" w:cs="Consolas"/>
+          <w:lang w:val="en-US"/>
+        </w:rPr>
+        <w:t>currentStock</w:t>
+      </w:r>
+      <w:proofErr w:type="spellEnd"/>
+      <w:r>
+        <w:rPr>
+          <w:rFonts w:ascii="Consolas" w:hAnsi="Consolas" w:cs="Consolas"/>
+          <w:lang w:val="en-US"/>
+        </w:rPr>
+        <w:t xml:space="preserve"> is less than or equal to the minimum stock</w:t>
+      </w:r>
+    </w:p>
+    <w:p>
+      <w:pPr>
+        <w:ind w:left="708" w:hanging="708"/>
+        <w:jc w:val="center"/>
+        <w:rPr>
+          <w:rFonts w:ascii="Consolas" w:hAnsi="Consolas" w:cs="Consolas"/>
+          <w:lang w:val="en-US"/>
+        </w:rPr>
+      </w:pPr>
+      <w:r>
+        <w:rPr>
+          <w:rFonts w:ascii="Consolas" w:hAnsi="Consolas" w:cs="Consolas"/>
+          <w:lang w:val="en-US"/>
+        </w:rPr>
+        <w:tab/>
+        <w:t>// if not, returns false</w:t>
+      </w:r>
+    </w:p>
+    <w:p>
+      <w:pPr>
+        <w:ind w:left="708" w:hanging="708"/>
+        <w:jc w:val="center"/>
+        <w:rPr>
+          <w:rFonts w:ascii="Consolas" w:hAnsi="Consolas" w:cs="Consolas"/>
+          <w:lang w:val="en-US"/>
+        </w:rPr>
+      </w:pPr>
+      <w:r>
+        <w:rPr>
+          <w:rFonts w:ascii="Consolas" w:hAnsi="Consolas" w:cs="Consolas"/>
+          <w:lang w:val="en-US"/>
+        </w:rPr>
+        <w:tab/>
+      </w:r>
+      <w:proofErr w:type="spellStart"/>
+      <w:r>
+        <w:rPr>
+          <w:rFonts w:ascii="Consolas" w:hAnsi="Consolas" w:cs="Consolas"/>
+          <w:lang w:val="en-US"/>
+        </w:rPr>
+        <w:t>requiresAudit</w:t>
+      </w:r>
+      <w:proofErr w:type="spellEnd"/>
+      <w:r>
+        <w:rPr>
+          <w:rFonts w:ascii="Consolas" w:hAnsi="Consolas" w:cs="Consolas"/>
+          <w:lang w:val="en-US"/>
+        </w:rPr>
+        <w:t xml:space="preserve"> &lt;- (</w:t>
+      </w:r>
+      <w:proofErr w:type="spellStart"/>
+      <w:r>
+        <w:rPr>
+          <w:rFonts w:ascii="Consolas" w:hAnsi="Consolas" w:cs="Consolas"/>
+          <w:lang w:val="en-US"/>
+        </w:rPr>
+        <w:t>currentStock</w:t>
+      </w:r>
+      <w:proofErr w:type="spellEnd"/>
+      <w:r>
+        <w:rPr>
+          <w:rFonts w:ascii="Consolas" w:hAnsi="Consolas" w:cs="Consolas"/>
+          <w:lang w:val="en-US"/>
+        </w:rPr>
+        <w:t>&lt;=</w:t>
+      </w:r>
+      <w:proofErr w:type="spellStart"/>
+      <w:r>
+        <w:rPr>
+          <w:rFonts w:ascii="Consolas" w:hAnsi="Consolas" w:cs="Consolas"/>
+          <w:lang w:val="en-US"/>
+        </w:rPr>
+        <w:t>minimumStock</w:t>
+      </w:r>
+      <w:proofErr w:type="spellEnd"/>
+      <w:r>
+        <w:rPr>
+          <w:rFonts w:ascii="Consolas" w:hAnsi="Consolas" w:cs="Consolas"/>
+          <w:lang w:val="en-US"/>
+        </w:rPr>
+        <w:t>) O (</w:t>
+      </w:r>
+      <w:proofErr w:type="spellStart"/>
+      <w:r>
+        <w:rPr>
+          <w:rFonts w:ascii="Consolas" w:hAnsi="Consolas" w:cs="Consolas"/>
+          <w:lang w:val="en-US"/>
+        </w:rPr>
+        <w:t>currentStock</w:t>
+      </w:r>
+      <w:proofErr w:type="spellEnd"/>
+      <w:r>
+        <w:rPr>
+          <w:rFonts w:ascii="Consolas" w:hAnsi="Consolas" w:cs="Consolas"/>
+          <w:lang w:val="en-US"/>
+        </w:rPr>
+        <w:t>&gt;</w:t>
+      </w:r>
+      <w:proofErr w:type="spellStart"/>
+      <w:r>
+        <w:rPr>
+          <w:rFonts w:ascii="Consolas" w:hAnsi="Consolas" w:cs="Consolas"/>
+          <w:lang w:val="en-US"/>
+        </w:rPr>
+        <w:t>maximumStock</w:t>
+      </w:r>
+      <w:proofErr w:type="spellEnd"/>
+      <w:r>
+        <w:rPr>
+          <w:rFonts w:ascii="Consolas" w:hAnsi="Consolas" w:cs="Consolas"/>
+          <w:lang w:val="en-US"/>
+        </w:rPr>
+        <w:t>)</w:t>
+      </w:r>
+    </w:p>
+    <w:p>
+      <w:pPr>
+        <w:ind w:left="708" w:hanging="708"/>
+        <w:jc w:val="center"/>
+        <w:rPr>
+          <w:rFonts w:ascii="Consolas" w:hAnsi="Consolas" w:cs="Consolas"/>
+        </w:rPr>
+      </w:pPr>
+      <w:r>
+        <w:rPr>
+          <w:rFonts w:ascii="Consolas" w:hAnsi="Consolas" w:cs="Consolas"/>
+          <w:lang w:val="en-US"/>
+        </w:rPr>
+        <w:tab/>
+      </w:r>
+      <w:r>
+        <w:rPr>
+          <w:rFonts w:ascii="Consolas" w:hAnsi="Consolas" w:cs="Consolas"/>
+        </w:rPr>
+        <w:t xml:space="preserve">Escribir </w:t>
+      </w:r>
+      <w:proofErr w:type="spellStart"/>
+      <w:r>
+        <w:rPr>
+          <w:rFonts w:ascii="Consolas" w:hAnsi="Consolas" w:cs="Consolas"/>
+        </w:rPr>
+        <w:t>requiresAudit</w:t>
+      </w:r>
+      <w:proofErr w:type="spellEnd"/>
+    </w:p>
+    <w:p>
+      <w:pPr>
+        <w:ind w:left="708" w:hanging="708"/>
+        <w:jc w:val="center"/>
+        <w:rPr>
+          <w:rFonts w:ascii="Consolas" w:hAnsi="Consolas" w:cs="Consolas"/>
+        </w:rPr>
+      </w:pPr>
+      <w:proofErr w:type="spellStart"/>
+      <w:r>
+        <w:rPr>
+          <w:rFonts w:ascii="Consolas" w:hAnsi="Consolas" w:cs="Consolas"/>
+        </w:rPr>
+        <w:t>FinAlgoritmo</w:t>
+      </w:r>
+      <w:proofErr w:type="spellEnd"/>
+    </w:p>
+    <w:p>
+      <w:pPr>
+        <w:ind w:left="708" w:hanging="708"/>
+        <w:rPr>
           <w:rFonts w:cs="Consolas"/>
+          <w:b/>
+          <w:bCs/>
         </w:rPr>
       </w:pPr>
     </w:p>
@@ -1350,6 +1269,7 @@
           <w:b/>
           <w:bCs/>
         </w:rPr>
+        <w:lastRenderedPageBreak/>
         <w:t>Diagrama de flujo</w:t>
       </w:r>
     </w:p>
@@ -1451,6 +1371,76 @@
         <w:jc w:val="center"/>
         <w:rPr>
           <w:rFonts w:cs="Consolas"/>
+        </w:rPr>
+      </w:pPr>
+    </w:p>
+    <w:p>
+      <w:pPr>
+        <w:ind w:left="708" w:hanging="708"/>
+        <w:rPr>
+          <w:rFonts w:cs="Consolas"/>
+          <w:b/>
+          <w:bCs/>
+        </w:rPr>
+      </w:pPr>
+    </w:p>
+    <w:p>
+      <w:pPr>
+        <w:ind w:left="708" w:hanging="708"/>
+        <w:rPr>
+          <w:rFonts w:cs="Consolas"/>
+          <w:b/>
+          <w:bCs/>
+        </w:rPr>
+      </w:pPr>
+    </w:p>
+    <w:p>
+      <w:pPr>
+        <w:ind w:left="708" w:hanging="708"/>
+        <w:rPr>
+          <w:rFonts w:cs="Consolas"/>
+          <w:b/>
+          <w:bCs/>
+        </w:rPr>
+      </w:pPr>
+    </w:p>
+    <w:p>
+      <w:pPr>
+        <w:ind w:left="708" w:hanging="708"/>
+        <w:rPr>
+          <w:rFonts w:cs="Consolas"/>
+          <w:b/>
+          <w:bCs/>
+        </w:rPr>
+      </w:pPr>
+    </w:p>
+    <w:p>
+      <w:pPr>
+        <w:ind w:left="708" w:hanging="708"/>
+        <w:rPr>
+          <w:rFonts w:cs="Consolas"/>
+          <w:b/>
+          <w:bCs/>
+        </w:rPr>
+      </w:pPr>
+    </w:p>
+    <w:p>
+      <w:pPr>
+        <w:ind w:left="708" w:hanging="708"/>
+        <w:rPr>
+          <w:rFonts w:cs="Consolas"/>
+          <w:b/>
+          <w:bCs/>
+        </w:rPr>
+      </w:pPr>
+    </w:p>
+    <w:p>
+      <w:pPr>
+        <w:ind w:left="708" w:hanging="708"/>
+        <w:rPr>
+          <w:rFonts w:cs="Consolas"/>
+          <w:b/>
+          <w:bCs/>
         </w:rPr>
       </w:pPr>
     </w:p>
@@ -8423,6 +8413,7 @@
   <w:style w:type="character" w:default="1" w:styleId="Fuentedeprrafopredeter">
     <w:name w:val="Default Paragraph Font"/>
     <w:uiPriority w:val="1"/>
+    <w:semiHidden/>
     <w:unhideWhenUsed/>
   </w:style>
   <w:style w:type="table" w:default="1" w:styleId="Tablanormal">

</xml_diff>